<commit_message>
Fix stale hardcoded FIG_DIR path in manuscript build script
build_manuscript.py pointed at a directory from the original
author's machine (BBBC021_fix) that doesn't exist in this checkout,
so add_figure() was silently falling back to "[Figure file not
found]" placeholder text for every figure instead of embedding them.
FIG_DIR is now derived from the script's own location.
</commit_message>
<xml_diff>
--- a/manuscript/BBBC021_Manuscript_REVISED.docx
+++ b/manuscript/BBBC021_Manuscript_REVISED.docx
@@ -5038,11 +5038,42 @@
       </w:r>
     </w:p>
     <w:p>
+      <w:pPr>
+        <w:jc w:val="center"/>
+      </w:pPr>
       <w:r>
-        <w:rPr>
-          <w:i/>
-        </w:rPr>
-        <w:t>[Figure file not found: C:\Users\nanda\Downloads\BBBC021_fix\final_figures\Figure_1.png]</w:t>
+        <w:drawing>
+          <wp:inline xmlns:a="http://schemas.openxmlformats.org/drawingml/2006/main" xmlns:pic="http://schemas.openxmlformats.org/drawingml/2006/picture">
+            <wp:extent cx="5303520" cy="1108232"/>
+            <wp:docPr id="1" name="Picture 1"/>
+            <wp:cNvGraphicFramePr>
+              <a:graphicFrameLocks noChangeAspect="1"/>
+            </wp:cNvGraphicFramePr>
+            <a:graphic>
+              <a:graphicData uri="http://schemas.openxmlformats.org/drawingml/2006/picture">
+                <pic:pic>
+                  <pic:nvPicPr>
+                    <pic:cNvPr id="0" name="Figure_1.png"/>
+                    <pic:cNvPicPr/>
+                  </pic:nvPicPr>
+                  <pic:blipFill>
+                    <a:blip r:embed="rId9"/>
+                    <a:stretch>
+                      <a:fillRect/>
+                    </a:stretch>
+                  </pic:blipFill>
+                  <pic:spPr>
+                    <a:xfrm>
+                      <a:off x="0" y="0"/>
+                      <a:ext cx="5303520" cy="1108232"/>
+                    </a:xfrm>
+                    <a:prstGeom prst="rect"/>
+                  </pic:spPr>
+                </pic:pic>
+              </a:graphicData>
+            </a:graphic>
+          </wp:inline>
+        </w:drawing>
       </w:r>
     </w:p>
     <w:p>
@@ -5058,11 +5089,42 @@
       </w:r>
     </w:p>
     <w:p>
+      <w:pPr>
+        <w:jc w:val="center"/>
+      </w:pPr>
       <w:r>
-        <w:rPr>
-          <w:i/>
-        </w:rPr>
-        <w:t>[Figure file not found: C:\Users\nanda\Downloads\BBBC021_fix\final_figures\Figure_2.png]</w:t>
+        <w:drawing>
+          <wp:inline xmlns:a="http://schemas.openxmlformats.org/drawingml/2006/main" xmlns:pic="http://schemas.openxmlformats.org/drawingml/2006/picture">
+            <wp:extent cx="5303520" cy="3444955"/>
+            <wp:docPr id="2" name="Picture 2"/>
+            <wp:cNvGraphicFramePr>
+              <a:graphicFrameLocks noChangeAspect="1"/>
+            </wp:cNvGraphicFramePr>
+            <a:graphic>
+              <a:graphicData uri="http://schemas.openxmlformats.org/drawingml/2006/picture">
+                <pic:pic>
+                  <pic:nvPicPr>
+                    <pic:cNvPr id="0" name="Figure_2.png"/>
+                    <pic:cNvPicPr/>
+                  </pic:nvPicPr>
+                  <pic:blipFill>
+                    <a:blip r:embed="rId10"/>
+                    <a:stretch>
+                      <a:fillRect/>
+                    </a:stretch>
+                  </pic:blipFill>
+                  <pic:spPr>
+                    <a:xfrm>
+                      <a:off x="0" y="0"/>
+                      <a:ext cx="5303520" cy="3444955"/>
+                    </a:xfrm>
+                    <a:prstGeom prst="rect"/>
+                  </pic:spPr>
+                </pic:pic>
+              </a:graphicData>
+            </a:graphic>
+          </wp:inline>
+        </w:drawing>
       </w:r>
     </w:p>
     <w:p>
@@ -5078,11 +5140,42 @@
       </w:r>
     </w:p>
     <w:p>
+      <w:pPr>
+        <w:jc w:val="center"/>
+      </w:pPr>
       <w:r>
-        <w:rPr>
-          <w:i/>
-        </w:rPr>
-        <w:t>[Figure file not found: C:\Users\nanda\Downloads\BBBC021_fix\final_figures\figure3_roc_feature_based_macro.png]</w:t>
+        <w:drawing>
+          <wp:inline xmlns:a="http://schemas.openxmlformats.org/drawingml/2006/main" xmlns:pic="http://schemas.openxmlformats.org/drawingml/2006/picture">
+            <wp:extent cx="5303520" cy="4545874"/>
+            <wp:docPr id="3" name="Picture 3"/>
+            <wp:cNvGraphicFramePr>
+              <a:graphicFrameLocks noChangeAspect="1"/>
+            </wp:cNvGraphicFramePr>
+            <a:graphic>
+              <a:graphicData uri="http://schemas.openxmlformats.org/drawingml/2006/picture">
+                <pic:pic>
+                  <pic:nvPicPr>
+                    <pic:cNvPr id="0" name="figure3_roc_feature_based_macro.png"/>
+                    <pic:cNvPicPr/>
+                  </pic:nvPicPr>
+                  <pic:blipFill>
+                    <a:blip r:embed="rId11"/>
+                    <a:stretch>
+                      <a:fillRect/>
+                    </a:stretch>
+                  </pic:blipFill>
+                  <pic:spPr>
+                    <a:xfrm>
+                      <a:off x="0" y="0"/>
+                      <a:ext cx="5303520" cy="4545874"/>
+                    </a:xfrm>
+                    <a:prstGeom prst="rect"/>
+                  </pic:spPr>
+                </pic:pic>
+              </a:graphicData>
+            </a:graphic>
+          </wp:inline>
+        </w:drawing>
       </w:r>
     </w:p>
     <w:p>
@@ -5098,11 +5191,42 @@
       </w:r>
     </w:p>
     <w:p>
+      <w:pPr>
+        <w:jc w:val="center"/>
+      </w:pPr>
       <w:r>
-        <w:rPr>
-          <w:i/>
-        </w:rPr>
-        <w:t>[Figure file not found: C:\Users\nanda\Downloads\BBBC021_fix\final_figures\figure3b_roc_random_forest_per_class.png]</w:t>
+        <w:drawing>
+          <wp:inline xmlns:a="http://schemas.openxmlformats.org/drawingml/2006/main" xmlns:pic="http://schemas.openxmlformats.org/drawingml/2006/picture">
+            <wp:extent cx="5303520" cy="4545874"/>
+            <wp:docPr id="4" name="Picture 4"/>
+            <wp:cNvGraphicFramePr>
+              <a:graphicFrameLocks noChangeAspect="1"/>
+            </wp:cNvGraphicFramePr>
+            <a:graphic>
+              <a:graphicData uri="http://schemas.openxmlformats.org/drawingml/2006/picture">
+                <pic:pic>
+                  <pic:nvPicPr>
+                    <pic:cNvPr id="0" name="figure3b_roc_random_forest_per_class.png"/>
+                    <pic:cNvPicPr/>
+                  </pic:nvPicPr>
+                  <pic:blipFill>
+                    <a:blip r:embed="rId12"/>
+                    <a:stretch>
+                      <a:fillRect/>
+                    </a:stretch>
+                  </pic:blipFill>
+                  <pic:spPr>
+                    <a:xfrm>
+                      <a:off x="0" y="0"/>
+                      <a:ext cx="5303520" cy="4545874"/>
+                    </a:xfrm>
+                    <a:prstGeom prst="rect"/>
+                  </pic:spPr>
+                </pic:pic>
+              </a:graphicData>
+            </a:graphic>
+          </wp:inline>
+        </w:drawing>
       </w:r>
     </w:p>
     <w:p>
@@ -5118,11 +5242,42 @@
       </w:r>
     </w:p>
     <w:p>
+      <w:pPr>
+        <w:jc w:val="center"/>
+      </w:pPr>
       <w:r>
-        <w:rPr>
-          <w:i/>
-        </w:rPr>
-        <w:t>[Figure file not found: C:\Users\nanda\Downloads\BBBC021_fix\final_figures\figure5_roc_deep_learning_macro.png]</w:t>
+        <w:drawing>
+          <wp:inline xmlns:a="http://schemas.openxmlformats.org/drawingml/2006/main" xmlns:pic="http://schemas.openxmlformats.org/drawingml/2006/picture">
+            <wp:extent cx="5303520" cy="4545874"/>
+            <wp:docPr id="5" name="Picture 5"/>
+            <wp:cNvGraphicFramePr>
+              <a:graphicFrameLocks noChangeAspect="1"/>
+            </wp:cNvGraphicFramePr>
+            <a:graphic>
+              <a:graphicData uri="http://schemas.openxmlformats.org/drawingml/2006/picture">
+                <pic:pic>
+                  <pic:nvPicPr>
+                    <pic:cNvPr id="0" name="figure5_roc_deep_learning_macro.png"/>
+                    <pic:cNvPicPr/>
+                  </pic:nvPicPr>
+                  <pic:blipFill>
+                    <a:blip r:embed="rId13"/>
+                    <a:stretch>
+                      <a:fillRect/>
+                    </a:stretch>
+                  </pic:blipFill>
+                  <pic:spPr>
+                    <a:xfrm>
+                      <a:off x="0" y="0"/>
+                      <a:ext cx="5303520" cy="4545874"/>
+                    </a:xfrm>
+                    <a:prstGeom prst="rect"/>
+                  </pic:spPr>
+                </pic:pic>
+              </a:graphicData>
+            </a:graphic>
+          </wp:inline>
+        </w:drawing>
       </w:r>
     </w:p>
     <w:p>
@@ -5138,11 +5293,42 @@
       </w:r>
     </w:p>
     <w:p>
+      <w:pPr>
+        <w:jc w:val="center"/>
+      </w:pPr>
       <w:r>
-        <w:rPr>
-          <w:i/>
-        </w:rPr>
-        <w:t>[Figure file not found: C:\Users\nanda\Downloads\BBBC021_fix\final_figures\figure5b_roc_resnet_pretrained_per_class.png]</w:t>
+        <w:drawing>
+          <wp:inline xmlns:a="http://schemas.openxmlformats.org/drawingml/2006/main" xmlns:pic="http://schemas.openxmlformats.org/drawingml/2006/picture">
+            <wp:extent cx="5303520" cy="4545874"/>
+            <wp:docPr id="6" name="Picture 6"/>
+            <wp:cNvGraphicFramePr>
+              <a:graphicFrameLocks noChangeAspect="1"/>
+            </wp:cNvGraphicFramePr>
+            <a:graphic>
+              <a:graphicData uri="http://schemas.openxmlformats.org/drawingml/2006/picture">
+                <pic:pic>
+                  <pic:nvPicPr>
+                    <pic:cNvPr id="0" name="figure5b_roc_resnet_pretrained_per_class.png"/>
+                    <pic:cNvPicPr/>
+                  </pic:nvPicPr>
+                  <pic:blipFill>
+                    <a:blip r:embed="rId14"/>
+                    <a:stretch>
+                      <a:fillRect/>
+                    </a:stretch>
+                  </pic:blipFill>
+                  <pic:spPr>
+                    <a:xfrm>
+                      <a:off x="0" y="0"/>
+                      <a:ext cx="5303520" cy="4545874"/>
+                    </a:xfrm>
+                    <a:prstGeom prst="rect"/>
+                  </pic:spPr>
+                </pic:pic>
+              </a:graphicData>
+            </a:graphic>
+          </wp:inline>
+        </w:drawing>
       </w:r>
     </w:p>
     <w:p>
@@ -5158,11 +5344,42 @@
       </w:r>
     </w:p>
     <w:p>
+      <w:pPr>
+        <w:jc w:val="center"/>
+      </w:pPr>
       <w:r>
-        <w:rPr>
-          <w:i/>
-        </w:rPr>
-        <w:t>[Figure file not found: C:\Users\nanda\Downloads\BBBC021_fix\final_figures\figure5c_seed_distribution.png]</w:t>
+        <w:drawing>
+          <wp:inline xmlns:a="http://schemas.openxmlformats.org/drawingml/2006/main" xmlns:pic="http://schemas.openxmlformats.org/drawingml/2006/picture">
+            <wp:extent cx="5303520" cy="2386584"/>
+            <wp:docPr id="7" name="Picture 7"/>
+            <wp:cNvGraphicFramePr>
+              <a:graphicFrameLocks noChangeAspect="1"/>
+            </wp:cNvGraphicFramePr>
+            <a:graphic>
+              <a:graphicData uri="http://schemas.openxmlformats.org/drawingml/2006/picture">
+                <pic:pic>
+                  <pic:nvPicPr>
+                    <pic:cNvPr id="0" name="figure5c_seed_distribution.png"/>
+                    <pic:cNvPicPr/>
+                  </pic:nvPicPr>
+                  <pic:blipFill>
+                    <a:blip r:embed="rId15"/>
+                    <a:stretch>
+                      <a:fillRect/>
+                    </a:stretch>
+                  </pic:blipFill>
+                  <pic:spPr>
+                    <a:xfrm>
+                      <a:off x="0" y="0"/>
+                      <a:ext cx="5303520" cy="2386584"/>
+                    </a:xfrm>
+                    <a:prstGeom prst="rect"/>
+                  </pic:spPr>
+                </pic:pic>
+              </a:graphicData>
+            </a:graphic>
+          </wp:inline>
+        </w:drawing>
       </w:r>
     </w:p>
     <w:p>
@@ -5178,11 +5395,42 @@
       </w:r>
     </w:p>
     <w:p>
+      <w:pPr>
+        <w:jc w:val="center"/>
+      </w:pPr>
       <w:r>
-        <w:rPr>
-          <w:i/>
-        </w:rPr>
-        <w:t>[Figure file not found: C:\Users\nanda\Downloads\BBBC021_fix\final_figures\figure_s7_cnn_loss_curves.png]</w:t>
+        <w:drawing>
+          <wp:inline xmlns:a="http://schemas.openxmlformats.org/drawingml/2006/main" xmlns:pic="http://schemas.openxmlformats.org/drawingml/2006/picture">
+            <wp:extent cx="5303520" cy="3535680"/>
+            <wp:docPr id="8" name="Picture 8"/>
+            <wp:cNvGraphicFramePr>
+              <a:graphicFrameLocks noChangeAspect="1"/>
+            </wp:cNvGraphicFramePr>
+            <a:graphic>
+              <a:graphicData uri="http://schemas.openxmlformats.org/drawingml/2006/picture">
+                <pic:pic>
+                  <pic:nvPicPr>
+                    <pic:cNvPr id="0" name="figure_s7_cnn_loss_curves.png"/>
+                    <pic:cNvPicPr/>
+                  </pic:nvPicPr>
+                  <pic:blipFill>
+                    <a:blip r:embed="rId16"/>
+                    <a:stretch>
+                      <a:fillRect/>
+                    </a:stretch>
+                  </pic:blipFill>
+                  <pic:spPr>
+                    <a:xfrm>
+                      <a:off x="0" y="0"/>
+                      <a:ext cx="5303520" cy="3535680"/>
+                    </a:xfrm>
+                    <a:prstGeom prst="rect"/>
+                  </pic:spPr>
+                </pic:pic>
+              </a:graphicData>
+            </a:graphic>
+          </wp:inline>
+        </w:drawing>
       </w:r>
     </w:p>
     <w:p>
@@ -5198,11 +5446,42 @@
       </w:r>
     </w:p>
     <w:p>
+      <w:pPr>
+        <w:jc w:val="center"/>
+      </w:pPr>
       <w:r>
-        <w:rPr>
-          <w:i/>
-        </w:rPr>
-        <w:t>[Figure file not found: C:\Users\nanda\Downloads\BBBC021_fix\final_figures\figure_s7b_resnet_scratch_loss_curves.png]</w:t>
+        <w:drawing>
+          <wp:inline xmlns:a="http://schemas.openxmlformats.org/drawingml/2006/main" xmlns:pic="http://schemas.openxmlformats.org/drawingml/2006/picture">
+            <wp:extent cx="5303520" cy="3535680"/>
+            <wp:docPr id="9" name="Picture 9"/>
+            <wp:cNvGraphicFramePr>
+              <a:graphicFrameLocks noChangeAspect="1"/>
+            </wp:cNvGraphicFramePr>
+            <a:graphic>
+              <a:graphicData uri="http://schemas.openxmlformats.org/drawingml/2006/picture">
+                <pic:pic>
+                  <pic:nvPicPr>
+                    <pic:cNvPr id="0" name="figure_s7b_resnet_scratch_loss_curves.png"/>
+                    <pic:cNvPicPr/>
+                  </pic:nvPicPr>
+                  <pic:blipFill>
+                    <a:blip r:embed="rId17"/>
+                    <a:stretch>
+                      <a:fillRect/>
+                    </a:stretch>
+                  </pic:blipFill>
+                  <pic:spPr>
+                    <a:xfrm>
+                      <a:off x="0" y="0"/>
+                      <a:ext cx="5303520" cy="3535680"/>
+                    </a:xfrm>
+                    <a:prstGeom prst="rect"/>
+                  </pic:spPr>
+                </pic:pic>
+              </a:graphicData>
+            </a:graphic>
+          </wp:inline>
+        </w:drawing>
       </w:r>
     </w:p>
     <w:p>
@@ -5218,11 +5497,42 @@
       </w:r>
     </w:p>
     <w:p>
+      <w:pPr>
+        <w:jc w:val="center"/>
+      </w:pPr>
       <w:r>
-        <w:rPr>
-          <w:i/>
-        </w:rPr>
-        <w:t>[Figure file not found: C:\Users\nanda\Downloads\BBBC021_fix\final_figures\figure_s7c_resnet_pretrained_loss_curves.png]</w:t>
+        <w:drawing>
+          <wp:inline xmlns:a="http://schemas.openxmlformats.org/drawingml/2006/main" xmlns:pic="http://schemas.openxmlformats.org/drawingml/2006/picture">
+            <wp:extent cx="5303520" cy="3535680"/>
+            <wp:docPr id="10" name="Picture 10"/>
+            <wp:cNvGraphicFramePr>
+              <a:graphicFrameLocks noChangeAspect="1"/>
+            </wp:cNvGraphicFramePr>
+            <a:graphic>
+              <a:graphicData uri="http://schemas.openxmlformats.org/drawingml/2006/picture">
+                <pic:pic>
+                  <pic:nvPicPr>
+                    <pic:cNvPr id="0" name="figure_s7c_resnet_pretrained_loss_curves.png"/>
+                    <pic:cNvPicPr/>
+                  </pic:nvPicPr>
+                  <pic:blipFill>
+                    <a:blip r:embed="rId18"/>
+                    <a:stretch>
+                      <a:fillRect/>
+                    </a:stretch>
+                  </pic:blipFill>
+                  <pic:spPr>
+                    <a:xfrm>
+                      <a:off x="0" y="0"/>
+                      <a:ext cx="5303520" cy="3535680"/>
+                    </a:xfrm>
+                    <a:prstGeom prst="rect"/>
+                  </pic:spPr>
+                </pic:pic>
+              </a:graphicData>
+            </a:graphic>
+          </wp:inline>
+        </w:drawing>
       </w:r>
     </w:p>
     <w:p>
@@ -5238,11 +5548,42 @@
       </w:r>
     </w:p>
     <w:p>
+      <w:pPr>
+        <w:jc w:val="center"/>
+      </w:pPr>
       <w:r>
-        <w:rPr>
-          <w:i/>
-        </w:rPr>
-        <w:t>[Figure file not found: C:\Users\nanda\Downloads\BBBC021_fix\final_figures\figure14_calibration_curves_multiclass.png]</w:t>
+        <w:drawing>
+          <wp:inline xmlns:a="http://schemas.openxmlformats.org/drawingml/2006/main" xmlns:pic="http://schemas.openxmlformats.org/drawingml/2006/picture">
+            <wp:extent cx="5303520" cy="3977640"/>
+            <wp:docPr id="11" name="Picture 11"/>
+            <wp:cNvGraphicFramePr>
+              <a:graphicFrameLocks noChangeAspect="1"/>
+            </wp:cNvGraphicFramePr>
+            <a:graphic>
+              <a:graphicData uri="http://schemas.openxmlformats.org/drawingml/2006/picture">
+                <pic:pic>
+                  <pic:nvPicPr>
+                    <pic:cNvPr id="0" name="figure14_calibration_curves_multiclass.png"/>
+                    <pic:cNvPicPr/>
+                  </pic:nvPicPr>
+                  <pic:blipFill>
+                    <a:blip r:embed="rId19"/>
+                    <a:stretch>
+                      <a:fillRect/>
+                    </a:stretch>
+                  </pic:blipFill>
+                  <pic:spPr>
+                    <a:xfrm>
+                      <a:off x="0" y="0"/>
+                      <a:ext cx="5303520" cy="3977640"/>
+                    </a:xfrm>
+                    <a:prstGeom prst="rect"/>
+                  </pic:spPr>
+                </pic:pic>
+              </a:graphicData>
+            </a:graphic>
+          </wp:inline>
+        </w:drawing>
       </w:r>
     </w:p>
     <w:p>
@@ -5258,11 +5599,42 @@
       </w:r>
     </w:p>
     <w:p>
+      <w:pPr>
+        <w:jc w:val="center"/>
+      </w:pPr>
       <w:r>
-        <w:rPr>
-          <w:i/>
-        </w:rPr>
-        <w:t>[Figure file not found: C:\Users\nanda\Downloads\BBBC021_fix\final_figures\figure17_feature_ablation.png]</w:t>
+        <w:drawing>
+          <wp:inline xmlns:a="http://schemas.openxmlformats.org/drawingml/2006/main" xmlns:pic="http://schemas.openxmlformats.org/drawingml/2006/picture">
+            <wp:extent cx="5303520" cy="3314700"/>
+            <wp:docPr id="12" name="Picture 12"/>
+            <wp:cNvGraphicFramePr>
+              <a:graphicFrameLocks noChangeAspect="1"/>
+            </wp:cNvGraphicFramePr>
+            <a:graphic>
+              <a:graphicData uri="http://schemas.openxmlformats.org/drawingml/2006/picture">
+                <pic:pic>
+                  <pic:nvPicPr>
+                    <pic:cNvPr id="0" name="figure17_feature_ablation.png"/>
+                    <pic:cNvPicPr/>
+                  </pic:nvPicPr>
+                  <pic:blipFill>
+                    <a:blip r:embed="rId20"/>
+                    <a:stretch>
+                      <a:fillRect/>
+                    </a:stretch>
+                  </pic:blipFill>
+                  <pic:spPr>
+                    <a:xfrm>
+                      <a:off x="0" y="0"/>
+                      <a:ext cx="5303520" cy="3314700"/>
+                    </a:xfrm>
+                    <a:prstGeom prst="rect"/>
+                  </pic:spPr>
+                </pic:pic>
+              </a:graphicData>
+            </a:graphic>
+          </wp:inline>
+        </w:drawing>
       </w:r>
     </w:p>
     <w:p>
@@ -5278,11 +5650,42 @@
       </w:r>
     </w:p>
     <w:p>
+      <w:pPr>
+        <w:jc w:val="center"/>
+      </w:pPr>
       <w:r>
-        <w:rPr>
-          <w:i/>
-        </w:rPr>
-        <w:t>[Figure file not found: C:\Users\nanda\Downloads\BBBC021_fix\final_figures\figure15_pca_batch_before.png]</w:t>
+        <w:drawing>
+          <wp:inline xmlns:a="http://schemas.openxmlformats.org/drawingml/2006/main" xmlns:pic="http://schemas.openxmlformats.org/drawingml/2006/picture">
+            <wp:extent cx="5303520" cy="3977640"/>
+            <wp:docPr id="13" name="Picture 13"/>
+            <wp:cNvGraphicFramePr>
+              <a:graphicFrameLocks noChangeAspect="1"/>
+            </wp:cNvGraphicFramePr>
+            <a:graphic>
+              <a:graphicData uri="http://schemas.openxmlformats.org/drawingml/2006/picture">
+                <pic:pic>
+                  <pic:nvPicPr>
+                    <pic:cNvPr id="0" name="figure15_pca_batch_before.png"/>
+                    <pic:cNvPicPr/>
+                  </pic:nvPicPr>
+                  <pic:blipFill>
+                    <a:blip r:embed="rId21"/>
+                    <a:stretch>
+                      <a:fillRect/>
+                    </a:stretch>
+                  </pic:blipFill>
+                  <pic:spPr>
+                    <a:xfrm>
+                      <a:off x="0" y="0"/>
+                      <a:ext cx="5303520" cy="3977640"/>
+                    </a:xfrm>
+                    <a:prstGeom prst="rect"/>
+                  </pic:spPr>
+                </pic:pic>
+              </a:graphicData>
+            </a:graphic>
+          </wp:inline>
+        </w:drawing>
       </w:r>
     </w:p>
     <w:p>
@@ -5298,11 +5701,42 @@
       </w:r>
     </w:p>
     <w:p>
+      <w:pPr>
+        <w:jc w:val="center"/>
+      </w:pPr>
       <w:r>
-        <w:rPr>
-          <w:i/>
-        </w:rPr>
-        <w:t>[Figure file not found: C:\Users\nanda\Downloads\BBBC021_fix\final_figures\figure16_pca_batch_after.png]</w:t>
+        <w:drawing>
+          <wp:inline xmlns:a="http://schemas.openxmlformats.org/drawingml/2006/main" xmlns:pic="http://schemas.openxmlformats.org/drawingml/2006/picture">
+            <wp:extent cx="5303520" cy="3977640"/>
+            <wp:docPr id="14" name="Picture 14"/>
+            <wp:cNvGraphicFramePr>
+              <a:graphicFrameLocks noChangeAspect="1"/>
+            </wp:cNvGraphicFramePr>
+            <a:graphic>
+              <a:graphicData uri="http://schemas.openxmlformats.org/drawingml/2006/picture">
+                <pic:pic>
+                  <pic:nvPicPr>
+                    <pic:cNvPr id="0" name="figure16_pca_batch_after.png"/>
+                    <pic:cNvPicPr/>
+                  </pic:nvPicPr>
+                  <pic:blipFill>
+                    <a:blip r:embed="rId22"/>
+                    <a:stretch>
+                      <a:fillRect/>
+                    </a:stretch>
+                  </pic:blipFill>
+                  <pic:spPr>
+                    <a:xfrm>
+                      <a:off x="0" y="0"/>
+                      <a:ext cx="5303520" cy="3977640"/>
+                    </a:xfrm>
+                    <a:prstGeom prst="rect"/>
+                  </pic:spPr>
+                </pic:pic>
+              </a:graphicData>
+            </a:graphic>
+          </wp:inline>
+        </w:drawing>
       </w:r>
     </w:p>
     <w:p>
@@ -5335,11 +5769,42 @@
       </w:r>
     </w:p>
     <w:p>
+      <w:pPr>
+        <w:jc w:val="center"/>
+      </w:pPr>
       <w:r>
-        <w:rPr>
-          <w:i/>
-        </w:rPr>
-        <w:t>[Figure file not found: C:\Users\nanda\Downloads\BBBC021_fix\final_figures\figure11_confusion_matrix_lr_12class.png]</w:t>
+        <w:drawing>
+          <wp:inline xmlns:a="http://schemas.openxmlformats.org/drawingml/2006/main" xmlns:pic="http://schemas.openxmlformats.org/drawingml/2006/picture">
+            <wp:extent cx="5303520" cy="4545874"/>
+            <wp:docPr id="15" name="Picture 15"/>
+            <wp:cNvGraphicFramePr>
+              <a:graphicFrameLocks noChangeAspect="1"/>
+            </wp:cNvGraphicFramePr>
+            <a:graphic>
+              <a:graphicData uri="http://schemas.openxmlformats.org/drawingml/2006/picture">
+                <pic:pic>
+                  <pic:nvPicPr>
+                    <pic:cNvPr id="0" name="figure11_confusion_matrix_lr_12class.png"/>
+                    <pic:cNvPicPr/>
+                  </pic:nvPicPr>
+                  <pic:blipFill>
+                    <a:blip r:embed="rId23"/>
+                    <a:stretch>
+                      <a:fillRect/>
+                    </a:stretch>
+                  </pic:blipFill>
+                  <pic:spPr>
+                    <a:xfrm>
+                      <a:off x="0" y="0"/>
+                      <a:ext cx="5303520" cy="4545874"/>
+                    </a:xfrm>
+                    <a:prstGeom prst="rect"/>
+                  </pic:spPr>
+                </pic:pic>
+              </a:graphicData>
+            </a:graphic>
+          </wp:inline>
+        </w:drawing>
       </w:r>
     </w:p>
     <w:p>
@@ -5355,11 +5820,42 @@
       </w:r>
     </w:p>
     <w:p>
+      <w:pPr>
+        <w:jc w:val="center"/>
+      </w:pPr>
       <w:r>
-        <w:rPr>
-          <w:i/>
-        </w:rPr>
-        <w:t>[Figure file not found: C:\Users\nanda\Downloads\BBBC021_fix\final_figures\figure12_confusion_matrix_rf_12class.png]</w:t>
+        <w:drawing>
+          <wp:inline xmlns:a="http://schemas.openxmlformats.org/drawingml/2006/main" xmlns:pic="http://schemas.openxmlformats.org/drawingml/2006/picture">
+            <wp:extent cx="5303520" cy="4545874"/>
+            <wp:docPr id="16" name="Picture 16"/>
+            <wp:cNvGraphicFramePr>
+              <a:graphicFrameLocks noChangeAspect="1"/>
+            </wp:cNvGraphicFramePr>
+            <a:graphic>
+              <a:graphicData uri="http://schemas.openxmlformats.org/drawingml/2006/picture">
+                <pic:pic>
+                  <pic:nvPicPr>
+                    <pic:cNvPr id="0" name="figure12_confusion_matrix_rf_12class.png"/>
+                    <pic:cNvPicPr/>
+                  </pic:nvPicPr>
+                  <pic:blipFill>
+                    <a:blip r:embed="rId24"/>
+                    <a:stretch>
+                      <a:fillRect/>
+                    </a:stretch>
+                  </pic:blipFill>
+                  <pic:spPr>
+                    <a:xfrm>
+                      <a:off x="0" y="0"/>
+                      <a:ext cx="5303520" cy="4545874"/>
+                    </a:xfrm>
+                    <a:prstGeom prst="rect"/>
+                  </pic:spPr>
+                </pic:pic>
+              </a:graphicData>
+            </a:graphic>
+          </wp:inline>
+        </w:drawing>
       </w:r>
     </w:p>
     <w:p>
@@ -5375,11 +5871,42 @@
       </w:r>
     </w:p>
     <w:p>
+      <w:pPr>
+        <w:jc w:val="center"/>
+      </w:pPr>
       <w:r>
-        <w:rPr>
-          <w:i/>
-        </w:rPr>
-        <w:t>[Figure file not found: C:\Users\nanda\Downloads\BBBC021_fix\final_figures\figure13_confusion_matrix_resnet_pretrained_12class.png]</w:t>
+        <w:drawing>
+          <wp:inline xmlns:a="http://schemas.openxmlformats.org/drawingml/2006/main" xmlns:pic="http://schemas.openxmlformats.org/drawingml/2006/picture">
+            <wp:extent cx="5303520" cy="4545874"/>
+            <wp:docPr id="17" name="Picture 17"/>
+            <wp:cNvGraphicFramePr>
+              <a:graphicFrameLocks noChangeAspect="1"/>
+            </wp:cNvGraphicFramePr>
+            <a:graphic>
+              <a:graphicData uri="http://schemas.openxmlformats.org/drawingml/2006/picture">
+                <pic:pic>
+                  <pic:nvPicPr>
+                    <pic:cNvPr id="0" name="figure13_confusion_matrix_resnet_pretrained_12class.png"/>
+                    <pic:cNvPicPr/>
+                  </pic:nvPicPr>
+                  <pic:blipFill>
+                    <a:blip r:embed="rId25"/>
+                    <a:stretch>
+                      <a:fillRect/>
+                    </a:stretch>
+                  </pic:blipFill>
+                  <pic:spPr>
+                    <a:xfrm>
+                      <a:off x="0" y="0"/>
+                      <a:ext cx="5303520" cy="4545874"/>
+                    </a:xfrm>
+                    <a:prstGeom prst="rect"/>
+                  </pic:spPr>
+                </pic:pic>
+              </a:graphicData>
+            </a:graphic>
+          </wp:inline>
+        </w:drawing>
       </w:r>
     </w:p>
     <w:p>
@@ -5395,11 +5922,42 @@
       </w:r>
     </w:p>
     <w:p>
+      <w:pPr>
+        <w:jc w:val="center"/>
+      </w:pPr>
       <w:r>
-        <w:rPr>
-          <w:i/>
-        </w:rPr>
-        <w:t>[Figure file not found: C:\Users\nanda\Downloads\BBBC021_fix\final_figures\supplementary_figure_s1_feature_correlation.png]</w:t>
+        <w:drawing>
+          <wp:inline xmlns:a="http://schemas.openxmlformats.org/drawingml/2006/main" xmlns:pic="http://schemas.openxmlformats.org/drawingml/2006/picture">
+            <wp:extent cx="5303520" cy="4242816"/>
+            <wp:docPr id="18" name="Picture 18"/>
+            <wp:cNvGraphicFramePr>
+              <a:graphicFrameLocks noChangeAspect="1"/>
+            </wp:cNvGraphicFramePr>
+            <a:graphic>
+              <a:graphicData uri="http://schemas.openxmlformats.org/drawingml/2006/picture">
+                <pic:pic>
+                  <pic:nvPicPr>
+                    <pic:cNvPr id="0" name="supplementary_figure_s1_feature_correlation.png"/>
+                    <pic:cNvPicPr/>
+                  </pic:nvPicPr>
+                  <pic:blipFill>
+                    <a:blip r:embed="rId26"/>
+                    <a:stretch>
+                      <a:fillRect/>
+                    </a:stretch>
+                  </pic:blipFill>
+                  <pic:spPr>
+                    <a:xfrm>
+                      <a:off x="0" y="0"/>
+                      <a:ext cx="5303520" cy="4242816"/>
+                    </a:xfrm>
+                    <a:prstGeom prst="rect"/>
+                  </pic:spPr>
+                </pic:pic>
+              </a:graphicData>
+            </a:graphic>
+          </wp:inline>
+        </w:drawing>
       </w:r>
     </w:p>
     <w:p>

</xml_diff>